<commit_message>
ZENUX_Update_Instruction: correct jump marks in document
Signed-off-by: mdoerr2s <m.doerr@zera.de>
</commit_message>
<xml_diff>
--- a/update-documentation/ZENUX_Update_Instruction.docx
+++ b/update-documentation/ZENUX_Update_Instruction.docx
@@ -1,6 +1,6 @@
 
 <file path=word/document.xml><?xml version="1.0" encoding="utf-8"?>
-<w:document xmlns:o="urn:schemas-microsoft-com:office:office" xmlns:r="http://schemas.openxmlformats.org/officeDocument/2006/relationships" xmlns:v="urn:schemas-microsoft-com:vml" xmlns:w="http://schemas.openxmlformats.org/wordprocessingml/2006/main" xmlns:w10="urn:schemas-microsoft-com:office:word" xmlns:wp="http://schemas.openxmlformats.org/drawingml/2006/wordprocessingDrawing" xmlns:wps="http://schemas.microsoft.com/office/word/2010/wordprocessingShape" xmlns:wpg="http://schemas.microsoft.com/office/word/2010/wordprocessingGroup" xmlns:mc="http://schemas.openxmlformats.org/markup-compatibility/2006" xmlns:wp14="http://schemas.microsoft.com/office/word/2010/wordprocessingDrawing" xmlns:w14="http://schemas.microsoft.com/office/word/2010/wordml" xmlns:w15="http://schemas.microsoft.com/office/word/2012/wordml" mc:Ignorable="w14 wp14 w15">
+<w:document xmlns:o="urn:schemas-microsoft-com:office:office" xmlns:r="http://schemas.openxmlformats.org/officeDocument/2006/relationships" xmlns:v="urn:schemas-microsoft-com:vml" xmlns:w="http://schemas.openxmlformats.org/wordprocessingml/2006/main" xmlns:w10="urn:schemas-microsoft-com:office:word" xmlns:wp="http://schemas.openxmlformats.org/drawingml/2006/wordprocessingDrawing" xmlns:pic="http://schemas.openxmlformats.org/drawingml/2006/picture" xmlns:wps="http://schemas.microsoft.com/office/word/2010/wordprocessingShape" xmlns:wpg="http://schemas.microsoft.com/office/word/2010/wordprocessingGroup" xmlns:mc="http://schemas.openxmlformats.org/markup-compatibility/2006" xmlns:wp14="http://schemas.microsoft.com/office/word/2010/wordprocessingDrawing" xmlns:w14="http://schemas.microsoft.com/office/word/2010/wordml" xmlns:w15="http://schemas.microsoft.com/office/word/2012/wordml" mc:Ignorable="w14 wp14 w15">
   <w:body>
     <w:p>
       <w:pPr>
@@ -14,10 +14,62 @@
         <w:rPr>
           <w:rFonts w:ascii="UnitPro-Regular" w:hAnsi="UnitPro-Regular"/>
         </w:rPr>
+        <w:drawing>
+          <wp:anchor behindDoc="1" distT="0" distB="0" distL="0" distR="0" simplePos="0" locked="0" layoutInCell="1" allowOverlap="1" relativeHeight="27">
+            <wp:simplePos x="0" y="0"/>
+            <wp:positionH relativeFrom="column">
+              <wp:posOffset>-572770</wp:posOffset>
+            </wp:positionH>
+            <wp:positionV relativeFrom="paragraph">
+              <wp:posOffset>-518160</wp:posOffset>
+            </wp:positionV>
+            <wp:extent cx="6840855" cy="4856480"/>
+            <wp:effectExtent l="0" t="0" r="0" b="0"/>
+            <wp:wrapNone/>
+            <wp:docPr id="1" name="Bild 48" descr="Farbfläche-15%"/>
+            <wp:cNvGraphicFramePr>
+              <a:graphicFrameLocks xmlns:a="http://schemas.openxmlformats.org/drawingml/2006/main" noChangeAspect="1"/>
+            </wp:cNvGraphicFramePr>
+            <a:graphic xmlns:a="http://schemas.openxmlformats.org/drawingml/2006/main">
+              <a:graphicData uri="http://schemas.openxmlformats.org/drawingml/2006/picture">
+                <pic:pic xmlns:pic="http://schemas.openxmlformats.org/drawingml/2006/picture">
+                  <pic:nvPicPr>
+                    <pic:cNvPr id="1" name="Bild 48" descr="Farbfläche-15%"/>
+                    <pic:cNvPicPr>
+                      <a:picLocks noChangeAspect="1" noChangeArrowheads="1"/>
+                    </pic:cNvPicPr>
+                  </pic:nvPicPr>
+                  <pic:blipFill>
+                    <a:blip r:embed="rId2"/>
+                    <a:srcRect l="0" t="3371" r="0" b="0"/>
+                    <a:stretch>
+                      <a:fillRect/>
+                    </a:stretch>
+                  </pic:blipFill>
+                  <pic:spPr bwMode="auto">
+                    <a:xfrm>
+                      <a:off x="0" y="0"/>
+                      <a:ext cx="6840855" cy="4856480"/>
+                    </a:xfrm>
+                    <a:prstGeom prst="rect">
+                      <a:avLst/>
+                    </a:prstGeom>
+                    <a:noFill/>
+                    <a:ln w="9525">
+                      <a:solidFill>
+                        <a:srgbClr val="7FBEA7"/>
+                      </a:solidFill>
+                    </a:ln>
+                  </pic:spPr>
+                </pic:pic>
+              </a:graphicData>
+            </a:graphic>
+          </wp:anchor>
+        </w:drawing>
         <mc:AlternateContent>
           <mc:Choice Requires="wps">
             <w:drawing>
-              <wp:anchor behindDoc="0" distT="635" distB="0" distL="0" distR="0" simplePos="0" locked="0" layoutInCell="1" allowOverlap="1" relativeHeight="29" wp14:anchorId="56ADB809">
+              <wp:anchor behindDoc="0" distT="635" distB="0" distL="0" distR="0" simplePos="0" locked="0" layoutInCell="1" allowOverlap="1" relativeHeight="30" wp14:anchorId="56ADB809">
                 <wp:simplePos x="0" y="0"/>
                 <wp:positionH relativeFrom="column">
                   <wp:posOffset>5996940</wp:posOffset>
@@ -28,7 +80,7 @@
                 <wp:extent cx="342900" cy="2832735"/>
                 <wp:effectExtent l="0" t="635" r="0" b="0"/>
                 <wp:wrapNone/>
-                <wp:docPr id="1" name="Text Box 16"/>
+                <wp:docPr id="2" name="Text Box 16"/>
                 <a:graphic xmlns:a="http://schemas.openxmlformats.org/drawingml/2006/main">
                   <a:graphicData uri="http://schemas.microsoft.com/office/word/2010/wordprocessingShape">
                     <wps:wsp>
@@ -84,7 +136,7 @@
                               <w:rPr>
                                 <w:color w:val="000000"/>
                               </w:rPr>
-                              <w:t>ZENUX_Update_MAN_EXT_EN_V003.docx</w:t>
+                              <w:t>ZENUX_Update_Instruction.docx</w:t>
                             </w:r>
                             <w:r>
                               <w:rPr>
@@ -109,7 +161,7 @@
                           </w:p>
                         </w:txbxContent>
                       </wps:txbx>
-                      <wps:bodyPr anchor="t" vert="vert270" upright="1">
+                      <wps:bodyPr lIns="45720" rIns="45720" tIns="91440" bIns="91440" anchor="t" vert="vert270" upright="1">
                         <a:noAutofit/>
                       </wps:bodyPr>
                     </wps:wsp>
@@ -155,7 +207,7 @@
                         <w:rPr>
                           <w:color w:val="000000"/>
                         </w:rPr>
-                        <w:t>ZENUX_Update_MAN_EXT_EN_V003.docx</w:t>
+                        <w:t>ZENUX_Update_Instruction.docx</w:t>
                       </w:r>
                       <w:r>
                         <w:rPr>
@@ -185,57 +237,6 @@
             </w:pict>
           </mc:Fallback>
         </mc:AlternateContent>
-        <w:drawing>
-          <wp:anchor behindDoc="1" distT="0" distB="0" distL="0" distR="0" simplePos="0" locked="0" layoutInCell="1" allowOverlap="1" relativeHeight="38">
-            <wp:simplePos x="0" y="0"/>
-            <wp:positionH relativeFrom="column">
-              <wp:posOffset>-572770</wp:posOffset>
-            </wp:positionH>
-            <wp:positionV relativeFrom="paragraph">
-              <wp:posOffset>-518160</wp:posOffset>
-            </wp:positionV>
-            <wp:extent cx="6840855" cy="4856480"/>
-            <wp:effectExtent l="0" t="0" r="0" b="0"/>
-            <wp:wrapNone/>
-            <wp:docPr id="2" name="Bild 48" descr="Farbfläche-15%"/>
-            <wp:cNvGraphicFramePr>
-              <a:graphicFrameLocks xmlns:a="http://schemas.openxmlformats.org/drawingml/2006/main" noChangeAspect="1"/>
-            </wp:cNvGraphicFramePr>
-            <a:graphic xmlns:a="http://schemas.openxmlformats.org/drawingml/2006/main">
-              <a:graphicData uri="http://schemas.openxmlformats.org/drawingml/2006/picture">
-                <pic:pic xmlns:pic="http://schemas.openxmlformats.org/drawingml/2006/picture">
-                  <pic:nvPicPr>
-                    <pic:cNvPr id="2" name="Bild 48" descr="Farbfläche-15%"/>
-                    <pic:cNvPicPr>
-                      <a:picLocks noChangeAspect="1" noChangeArrowheads="1"/>
-                    </pic:cNvPicPr>
-                  </pic:nvPicPr>
-                  <pic:blipFill>
-                    <a:blip r:embed="rId2"/>
-                    <a:srcRect l="0" t="3371" r="0" b="0"/>
-                    <a:stretch>
-                      <a:fillRect/>
-                    </a:stretch>
-                  </pic:blipFill>
-                  <pic:spPr bwMode="auto">
-                    <a:xfrm>
-                      <a:off x="0" y="0"/>
-                      <a:ext cx="6840855" cy="4856480"/>
-                    </a:xfrm>
-                    <a:prstGeom prst="rect">
-                      <a:avLst/>
-                    </a:prstGeom>
-                    <a:ln w="9525">
-                      <a:solidFill>
-                        <a:srgbClr val="7FBEA7"/>
-                      </a:solidFill>
-                    </a:ln>
-                  </pic:spPr>
-                </pic:pic>
-              </a:graphicData>
-            </a:graphic>
-          </wp:anchor>
-        </w:drawing>
       </w:r>
     </w:p>
     <w:p>
@@ -252,7 +253,7 @@
         <mc:AlternateContent>
           <mc:Choice Requires="wps">
             <w:drawing>
-              <wp:anchor behindDoc="0" distT="5080" distB="5080" distL="5715" distR="4445" simplePos="0" locked="0" layoutInCell="1" allowOverlap="1" relativeHeight="27" wp14:anchorId="02D58166">
+              <wp:anchor behindDoc="0" distT="5080" distB="5080" distL="5715" distR="4445" simplePos="0" locked="0" layoutInCell="1" allowOverlap="1" relativeHeight="28" wp14:anchorId="02D58166">
                 <wp:simplePos x="0" y="0"/>
                 <wp:positionH relativeFrom="column">
                   <wp:posOffset>0</wp:posOffset>
@@ -296,7 +297,7 @@
                         <w:txbxContent>
                           <w:p>
                             <w:pPr>
-                              <w:pStyle w:val="FrameContents"/>
+                              <w:pStyle w:val="FrameContentsuser"/>
                               <w:jc w:val="center"/>
                               <w:rPr>
                                 <w:sz w:val="96"/>
@@ -314,7 +315,7 @@
                           </w:p>
                           <w:p>
                             <w:pPr>
-                              <w:pStyle w:val="FrameContents"/>
+                              <w:pStyle w:val="FrameContentsuser"/>
                               <w:jc w:val="center"/>
                               <w:rPr>
                                 <w:sz w:val="96"/>
@@ -352,7 +353,7 @@
                   <w:txbxContent>
                     <w:p>
                       <w:pPr>
-                        <w:pStyle w:val="FrameContents"/>
+                        <w:pStyle w:val="FrameContentsuser"/>
                         <w:jc w:val="center"/>
                         <w:rPr>
                           <w:sz w:val="96"/>
@@ -370,7 +371,7 @@
                     </w:p>
                     <w:p>
                       <w:pPr>
-                        <w:pStyle w:val="FrameContents"/>
+                        <w:pStyle w:val="FrameContentsuser"/>
                         <w:jc w:val="center"/>
                         <w:rPr>
                           <w:sz w:val="96"/>
@@ -808,6 +809,7 @@
                     <a:prstGeom prst="rect">
                       <a:avLst/>
                     </a:prstGeom>
+                    <a:noFill/>
                   </pic:spPr>
                 </pic:pic>
               </a:graphicData>
@@ -1002,7 +1004,7 @@
         <mc:AlternateContent>
           <mc:Choice Requires="wps">
             <w:drawing>
-              <wp:anchor behindDoc="0" distT="0" distB="3175" distL="0" distR="0" simplePos="0" locked="0" layoutInCell="1" allowOverlap="1" relativeHeight="34" wp14:anchorId="3D9CC58C">
+              <wp:anchor behindDoc="0" distT="0" distB="3175" distL="0" distR="0" simplePos="0" locked="0" layoutInCell="1" allowOverlap="1" relativeHeight="35" wp14:anchorId="3D9CC58C">
                 <wp:simplePos x="0" y="0"/>
                 <wp:positionH relativeFrom="column">
                   <wp:posOffset>2440305</wp:posOffset>
@@ -1043,7 +1045,7 @@
                         <w:txbxContent>
                           <w:p>
                             <w:pPr>
-                              <w:pStyle w:val="FrameContents"/>
+                              <w:pStyle w:val="FrameContentsuser"/>
                               <w:rPr>
                                 <w:color w:val="000000"/>
                               </w:rPr>
@@ -1056,7 +1058,7 @@
                           </w:p>
                           <w:p>
                             <w:pPr>
-                              <w:pStyle w:val="FrameContents"/>
+                              <w:pStyle w:val="FrameContentsuser"/>
                               <w:rPr>
                                 <w:color w:val="000000"/>
                               </w:rPr>
@@ -1096,6 +1098,7 @@
                                           <a:prstGeom prst="rect">
                                             <a:avLst/>
                                           </a:prstGeom>
+                                          <a:noFill/>
                                         </pic:spPr>
                                       </pic:pic>
                                     </a:graphicData>
@@ -1124,7 +1127,7 @@
                   <w:txbxContent>
                     <w:p>
                       <w:pPr>
-                        <w:pStyle w:val="FrameContents"/>
+                        <w:pStyle w:val="FrameContentsuser"/>
                         <w:rPr>
                           <w:color w:val="000000"/>
                         </w:rPr>
@@ -1137,7 +1140,7 @@
                     </w:p>
                     <w:p>
                       <w:pPr>
-                        <w:pStyle w:val="FrameContents"/>
+                        <w:pStyle w:val="FrameContentsuser"/>
                         <w:rPr>
                           <w:color w:val="000000"/>
                         </w:rPr>
@@ -1177,6 +1180,7 @@
                                     <a:prstGeom prst="rect">
                                       <a:avLst/>
                                     </a:prstGeom>
+                                    <a:noFill/>
                                   </pic:spPr>
                                 </pic:pic>
                               </a:graphicData>
@@ -1223,7 +1227,7 @@
         <mc:AlternateContent>
           <mc:Choice Requires="wps">
             <w:drawing>
-              <wp:anchor behindDoc="0" distT="5080" distB="5080" distL="5080" distR="5080" simplePos="0" locked="0" layoutInCell="1" allowOverlap="1" relativeHeight="31" wp14:anchorId="5AB82D4B">
+              <wp:anchor behindDoc="0" distT="5080" distB="5080" distL="5080" distR="5080" simplePos="0" locked="0" layoutInCell="1" allowOverlap="1" relativeHeight="32" wp14:anchorId="5AB82D4B">
                 <wp:simplePos x="0" y="0"/>
                 <wp:positionH relativeFrom="column">
                   <wp:posOffset>-571500</wp:posOffset>
@@ -1280,7 +1284,7 @@
         <mc:AlternateContent>
           <mc:Choice Requires="wps">
             <w:drawing>
-              <wp:anchor behindDoc="0" distT="5080" distB="5080" distL="5080" distR="5080" simplePos="0" locked="0" layoutInCell="1" allowOverlap="1" relativeHeight="32" wp14:anchorId="4F70323F">
+              <wp:anchor behindDoc="0" distT="5080" distB="5080" distL="5080" distR="5080" simplePos="0" locked="0" layoutInCell="1" allowOverlap="1" relativeHeight="33" wp14:anchorId="4F70323F">
                 <wp:simplePos x="0" y="0"/>
                 <wp:positionH relativeFrom="column">
                   <wp:posOffset>-571500</wp:posOffset>
@@ -1337,7 +1341,7 @@
         <mc:AlternateContent>
           <mc:Choice Requires="wps">
             <w:drawing>
-              <wp:anchor behindDoc="0" distT="5080" distB="5080" distL="5080" distR="5080" simplePos="0" locked="0" layoutInCell="1" allowOverlap="1" relativeHeight="33" wp14:anchorId="160F4314">
+              <wp:anchor behindDoc="0" distT="5080" distB="5080" distL="5080" distR="5080" simplePos="0" locked="0" layoutInCell="1" allowOverlap="1" relativeHeight="34" wp14:anchorId="160F4314">
                 <wp:simplePos x="0" y="0"/>
                 <wp:positionH relativeFrom="column">
                   <wp:posOffset>-568325</wp:posOffset>
@@ -1836,7 +1840,7 @@
         <mc:AlternateContent>
           <mc:Choice Requires="wps">
             <w:drawing>
-              <wp:anchor behindDoc="0" distT="0" distB="0" distL="114300" distR="118745" simplePos="0" locked="0" layoutInCell="0" allowOverlap="1" relativeHeight="36" wp14:anchorId="447B0704">
+              <wp:anchor behindDoc="0" distT="0" distB="0" distL="114300" distR="118745" simplePos="0" locked="0" layoutInCell="0" allowOverlap="1" relativeHeight="37" wp14:anchorId="447B0704">
                 <wp:simplePos x="0" y="0"/>
                 <wp:positionH relativeFrom="column">
                   <wp:posOffset>0</wp:posOffset>
@@ -1875,7 +1879,7 @@
                         <w:txbxContent>
                           <w:p>
                             <w:pPr>
-                              <w:pStyle w:val="FrameContents"/>
+                              <w:pStyle w:val="FrameContentsuser"/>
                               <w:ind w:right="-110"/>
                               <w:rPr>
                                 <w:color w:val="000000"/>
@@ -1916,6 +1920,7 @@
                                           <a:prstGeom prst="rect">
                                             <a:avLst/>
                                           </a:prstGeom>
+                                          <a:noFill/>
                                         </pic:spPr>
                                       </pic:pic>
                                     </a:graphicData>
@@ -1944,7 +1949,7 @@
                   <w:txbxContent>
                     <w:p>
                       <w:pPr>
-                        <w:pStyle w:val="FrameContents"/>
+                        <w:pStyle w:val="FrameContentsuser"/>
                         <w:ind w:right="-110"/>
                         <w:rPr>
                           <w:color w:val="000000"/>
@@ -1985,6 +1990,7 @@
                                     <a:prstGeom prst="rect">
                                       <a:avLst/>
                                     </a:prstGeom>
+                                    <a:noFill/>
                                   </pic:spPr>
                                 </pic:pic>
                               </a:graphicData>
@@ -2017,15 +2023,7 @@
       </w:r>
       <w:r>
         <w:rPr/>
-        <w:t>: 2</w:t>
-      </w:r>
-      <w:r>
-        <w:rPr/>
-        <w:t>8</w:t>
-      </w:r>
-      <w:r>
-        <w:rPr/>
-        <w:t>.03.2025</w:t>
+        <w:t>: 28.03.2025</w:t>
         <w:br/>
       </w:r>
     </w:p>
@@ -2067,6 +2065,7 @@
                     <a:prstGeom prst="rect">
                       <a:avLst/>
                     </a:prstGeom>
+                    <a:noFill/>
                   </pic:spPr>
                 </pic:pic>
               </a:graphicData>
@@ -2354,20 +2353,7 @@
           <w:szCs w:val="20"/>
           <w:lang w:val="de-DE" w:eastAsia="de-DE" w:bidi="ar-SA"/>
         </w:rPr>
-        <w:t>Important</w:t>
-      </w:r>
-      <w:r>
-        <w:rPr>
-          <w:rFonts w:eastAsia="Times New Roman" w:cs="Times New Roman"/>
-          <w:b/>
-          <w:bCs/>
-          <w:color w:val="C9211E"/>
-          <w:kern w:val="0"/>
-          <w:sz w:val="20"/>
-          <w:szCs w:val="20"/>
-          <w:lang w:val="de-DE" w:eastAsia="de-DE" w:bidi="ar-SA"/>
-        </w:rPr>
-        <w:t>:</w:t>
+        <w:t>Important:</w:t>
       </w:r>
       <w:r>
         <w:rPr>
@@ -2471,29 +2457,7 @@
           <w:szCs w:val="20"/>
           <w:lang w:val="de-DE" w:eastAsia="de-DE" w:bidi="ar-SA"/>
         </w:rPr>
-        <w:t>..</w:t>
-      </w:r>
-      <w:r>
-        <w:rPr>
-          <w:rFonts w:eastAsia="Times New Roman" w:cs="Times New Roman"/>
-          <w:color w:val="auto"/>
-          <w:kern w:val="0"/>
-          <w:sz w:val="20"/>
-          <w:szCs w:val="20"/>
-          <w:lang w:val="de-DE" w:eastAsia="de-DE" w:bidi="ar-SA"/>
-        </w:rPr>
-        <w:t>at least the</w:t>
-      </w:r>
-      <w:r>
-        <w:rPr>
-          <w:rFonts w:eastAsia="Times New Roman" w:cs="Times New Roman"/>
-          <w:color w:val="auto"/>
-          <w:kern w:val="0"/>
-          <w:sz w:val="20"/>
-          <w:szCs w:val="20"/>
-          <w:lang w:val="de-DE" w:eastAsia="de-DE" w:bidi="ar-SA"/>
-        </w:rPr>
-        <w:t xml:space="preserve"> version ‘release-</w:t>
+        <w:t>..at least the version ‘release-</w:t>
       </w:r>
       <w:r>
         <w:rPr>
@@ -2595,7 +2559,7 @@
           <w:color w:val="auto"/>
           <w:lang w:val="de-DE" w:eastAsia="de-DE" w:bidi="ar-SA"/>
         </w:rPr>
-        <w:instrText xml:space="preserve"> REF __RefNumPara__2248_4106663896 \r \h </w:instrText>
+        <w:instrText xml:space="preserve"> REF __RefNumPara__2248_4106663896 \r \r \h </w:instrText>
       </w:r>
       <w:r>
         <w:rPr>
@@ -2689,7 +2653,7 @@
           <w:szCs w:val="20"/>
           <w:bCs/>
         </w:rPr>
-        <w:instrText xml:space="preserve"> REF __RefNumPara__1236_1865731133 \r \h </w:instrText>
+        <w:instrText xml:space="preserve"> REF __RefNumPara__1236_1865731133 \r \r \h </w:instrText>
       </w:r>
       <w:r>
         <w:rPr>
@@ -2925,9 +2889,9 @@
                   <wp:posOffset>-22860</wp:posOffset>
                 </wp:positionH>
                 <wp:positionV relativeFrom="paragraph">
-                  <wp:posOffset>40005</wp:posOffset>
+                  <wp:posOffset>39370</wp:posOffset>
                 </wp:positionV>
-                <wp:extent cx="5605780" cy="0"/>
+                <wp:extent cx="5605780" cy="635"/>
                 <wp:effectExtent l="635" t="635" r="635" b="635"/>
                 <wp:wrapNone/>
                 <wp:docPr id="11" name="Horizontal line 1"/>
@@ -2938,7 +2902,7 @@
                       <wps:spPr>
                         <a:xfrm>
                           <a:off x="0" y="0"/>
-                          <a:ext cx="5605920" cy="0"/>
+                          <a:ext cx="5605920" cy="720"/>
                         </a:xfrm>
                         <a:prstGeom prst="line">
                           <a:avLst/>
@@ -2964,7 +2928,7 @@
           </mc:Choice>
           <mc:Fallback>
             <w:pict>
-              <v:line id="shape_0" from="-1.8pt,3.15pt" to="439.55pt,3.15pt" ID="Horizontal line 1" stroked="t" o:allowincell="f" style="position:absolute">
+              <v:line id="shape_0" from="-1.8pt,3.1pt" to="439.55pt,3.1pt" ID="Horizontal line 1" stroked="t" o:allowincell="f" style="position:absolute">
                 <v:stroke color="gray" joinstyle="round" endcap="flat"/>
                 <v:fill o:detectmouseclick="t" on="false"/>
                 <w10:wrap type="none"/>
@@ -3022,29 +2986,6 @@
         <w:t>Please follow the sequence below. To avoid issues it is important to follow the exact sequence:</w:t>
       </w:r>
       <w:bookmarkEnd w:id="0"/>
-    </w:p>
-    <w:p>
-      <w:pPr>
-        <w:pStyle w:val="Normal"/>
-        <w:rPr>
-          <w:rFonts w:ascii="Arial" w:hAnsi="Arial" w:eastAsia="Times New Roman" w:cs="Times New Roman"/>
-          <w:color w:val="auto"/>
-          <w:kern w:val="0"/>
-          <w:sz w:val="20"/>
-          <w:szCs w:val="24"/>
-          <w:lang w:val="de-DE" w:eastAsia="de-DE" w:bidi="ar-SA"/>
-        </w:rPr>
-      </w:pPr>
-      <w:r>
-        <w:rPr>
-          <w:rFonts w:eastAsia="Times New Roman" w:cs="Times New Roman"/>
-          <w:color w:val="auto"/>
-          <w:kern w:val="0"/>
-          <w:sz w:val="20"/>
-          <w:szCs w:val="24"/>
-          <w:lang w:val="de-DE" w:eastAsia="de-DE" w:bidi="ar-SA"/>
-        </w:rPr>
-      </w:r>
     </w:p>
     <w:p>
       <w:pPr>
@@ -3144,6 +3085,7 @@
                     <a:prstGeom prst="rect">
                       <a:avLst/>
                     </a:prstGeom>
+                    <a:noFill/>
                   </pic:spPr>
                 </pic:pic>
               </a:graphicData>
@@ -3208,6 +3150,7 @@
                     <a:prstGeom prst="rect">
                       <a:avLst/>
                     </a:prstGeom>
+                    <a:noFill/>
                   </pic:spPr>
                 </pic:pic>
               </a:graphicData>
@@ -3274,6 +3217,7 @@
                     <a:prstGeom prst="rect">
                       <a:avLst/>
                     </a:prstGeom>
+                    <a:noFill/>
                   </pic:spPr>
                 </pic:pic>
               </a:graphicData>
@@ -3337,6 +3281,7 @@
                     <a:prstGeom prst="rect">
                       <a:avLst/>
                     </a:prstGeom>
+                    <a:noFill/>
                   </pic:spPr>
                 </pic:pic>
               </a:graphicData>
@@ -3426,6 +3371,7 @@
                     <a:prstGeom prst="rect">
                       <a:avLst/>
                     </a:prstGeom>
+                    <a:noFill/>
                   </pic:spPr>
                 </pic:pic>
               </a:graphicData>
@@ -3508,6 +3454,7 @@
                     <a:prstGeom prst="rect">
                       <a:avLst/>
                     </a:prstGeom>
+                    <a:noFill/>
                   </pic:spPr>
                 </pic:pic>
               </a:graphicData>
@@ -3556,7 +3503,7 @@
           <w:b/>
           <w:bCs/>
         </w:rPr>
-        <w:instrText xml:space="preserve"> REF __RefNumPara__2205_4106663896 \r \h </w:instrText>
+        <w:instrText xml:space="preserve"> REF __RefNumPara__466_2630964111 \r \r \h </w:instrText>
       </w:r>
       <w:r>
         <w:rPr>
@@ -3570,7 +3517,7 @@
           <w:b/>
           <w:bCs/>
         </w:rPr>
-        <w:t>15</w:t>
+        <w:t>13</w:t>
       </w:r>
       <w:r>
         <w:rPr>
@@ -3626,6 +3573,7 @@
                     <a:prstGeom prst="rect">
                       <a:avLst/>
                     </a:prstGeom>
+                    <a:noFill/>
                   </pic:spPr>
                 </pic:pic>
               </a:graphicData>
@@ -3746,6 +3694,7 @@
                     <a:prstGeom prst="rect">
                       <a:avLst/>
                     </a:prstGeom>
+                    <a:noFill/>
                   </pic:spPr>
                 </pic:pic>
               </a:graphicData>
@@ -3763,7 +3712,7 @@
                 <wp:positionV relativeFrom="paragraph">
                   <wp:posOffset>1026795</wp:posOffset>
                 </wp:positionV>
-                <wp:extent cx="2286000" cy="2079625"/>
+                <wp:extent cx="2285365" cy="2079625"/>
                 <wp:effectExtent l="18415" t="18415" r="0" b="0"/>
                 <wp:wrapNone/>
                 <wp:docPr id="21" name="Line 3"/>
@@ -3774,7 +3723,7 @@
                       <wps:spPr>
                         <a:xfrm>
                           <a:off x="0" y="0"/>
-                          <a:ext cx="2286000" cy="2079720"/>
+                          <a:ext cx="2285280" cy="2079720"/>
                         </a:xfrm>
                         <a:prstGeom prst="line">
                           <a:avLst/>
@@ -3805,7 +3754,7 @@
           </mc:Choice>
           <mc:Fallback>
             <w:pict>
-              <v:line id="shape_0" from="257.45pt,80.85pt" to="437.4pt,244.55pt" ID="Line 3" stroked="t" o:allowincell="f" style="position:absolute">
+              <v:line id="shape_0" from="257.45pt,80.85pt" to="437.35pt,244.55pt" ID="Line 3" stroked="t" o:allowincell="f" style="position:absolute">
                 <v:stroke color="red" weight="36360" dashstyle="longdash" endarrow="block" endarrowwidth="medium" endarrowlength="medium" joinstyle="round" endcap="flat"/>
                 <v:fill o:detectmouseclick="t" on="false"/>
                 <w10:wrap type="none"/>
@@ -3869,7 +3818,7 @@
           <w:b/>
           <w:bCs/>
         </w:rPr>
-        <w:instrText xml:space="preserve"> REF __RefNumPara__2216_4106663896 \r \h </w:instrText>
+        <w:instrText xml:space="preserve"> REF __RefNumPara__2216_4106663896 \r \r \h </w:instrText>
       </w:r>
       <w:r>
         <w:rPr>
@@ -3924,7 +3873,7 @@
           <w:b/>
           <w:bCs/>
         </w:rPr>
-        <w:instrText xml:space="preserve"> REF __RefNumPara__2188_4106663896 \r \h </w:instrText>
+        <w:instrText xml:space="preserve"> REF __RefNumPara__2188_4106663896 \r \r \h </w:instrText>
       </w:r>
       <w:r>
         <w:rPr>
@@ -3966,6 +3915,8 @@
         <w:spacing w:before="0" w:after="0"/>
         <w:rPr/>
       </w:pPr>
+      <w:bookmarkStart w:id="8" w:name="__RefNumPara__466_2630964111"/>
+      <w:bookmarkEnd w:id="8"/>
       <w:r>
         <w:rPr/>
         <w:t xml:space="preserve">Install the operting system. Repeat steps </w:t>
@@ -3982,7 +3933,7 @@
           <w:b/>
           <w:bCs/>
         </w:rPr>
-        <w:instrText xml:space="preserve"> REF __RefNumPara__2222_4106663896 \r \h </w:instrText>
+        <w:instrText xml:space="preserve"> REF __RefNumPara__2222_4106663896 \r \r \h </w:instrText>
       </w:r>
       <w:r>
         <w:rPr>
@@ -4021,7 +3972,7 @@
           <w:b/>
           <w:bCs/>
         </w:rPr>
-        <w:instrText xml:space="preserve"> REF __RefNumPara__2188_4106663896 \r \h </w:instrText>
+        <w:instrText xml:space="preserve"> REF __RefNumPara__2188_4106663896 \r \r \h </w:instrText>
       </w:r>
       <w:r>
         <w:rPr>
@@ -4095,6 +4046,7 @@
                     <a:prstGeom prst="rect">
                       <a:avLst/>
                     </a:prstGeom>
+                    <a:noFill/>
                   </pic:spPr>
                 </pic:pic>
               </a:graphicData>
@@ -4370,7 +4322,7 @@
           <w:b/>
           <w:bCs/>
         </w:rPr>
-        <w:instrText xml:space="preserve"> REF __RefNumPara__2236_4106663896 \r \h </w:instrText>
+        <w:instrText xml:space="preserve"> REF __RefNumPara__2236_4106663896 \r \r \h </w:instrText>
       </w:r>
       <w:r>
         <w:rPr>
@@ -4409,7 +4361,7 @@
           <w:b/>
           <w:bCs/>
         </w:rPr>
-        <w:instrText xml:space="preserve"> REF __RefNumPara__2188_4106663896 \r \h </w:instrText>
+        <w:instrText xml:space="preserve"> REF __RefNumPara__2188_4106663896 \r \r \h </w:instrText>
       </w:r>
       <w:r>
         <w:rPr>
@@ -4476,6 +4428,7 @@
                     <a:prstGeom prst="rect">
                       <a:avLst/>
                     </a:prstGeom>
+                    <a:noFill/>
                   </pic:spPr>
                 </pic:pic>
               </a:graphicData>
@@ -4546,8 +4499,8 @@
         <w:spacing w:before="0" w:after="0"/>
         <w:rPr/>
       </w:pPr>
-      <w:bookmarkStart w:id="8" w:name="__RefNumPara__1236_1865731133"/>
-      <w:bookmarkEnd w:id="8"/>
+      <w:bookmarkStart w:id="9" w:name="__RefNumPara__1236_1865731133"/>
+      <w:bookmarkEnd w:id="9"/>
       <w:r>
         <w:rPr/>
         <w:t>Update process for devices running on software version 4.7.3  or higher.</w:t>
@@ -4577,8 +4530,8 @@
         </w:numPr>
         <w:rPr/>
       </w:pPr>
-      <w:bookmarkStart w:id="9" w:name="__RefNumPara__2205_4106663896"/>
-      <w:bookmarkEnd w:id="9"/>
+      <w:bookmarkStart w:id="10" w:name="__RefNumPara__2205_4106663896"/>
+      <w:bookmarkEnd w:id="10"/>
       <w:r>
         <w:rPr/>
         <w:t>Copy the update file</w:t>
@@ -4854,6 +4807,7 @@
                     <a:prstGeom prst="rect">
                       <a:avLst/>
                     </a:prstGeom>
+                    <a:noFill/>
                   </pic:spPr>
                 </pic:pic>
               </a:graphicData>
@@ -4928,6 +4882,7 @@
                     <a:prstGeom prst="rect">
                       <a:avLst/>
                     </a:prstGeom>
+                    <a:noFill/>
                   </pic:spPr>
                 </pic:pic>
               </a:graphicData>
@@ -4980,6 +4935,7 @@
                     <a:prstGeom prst="rect">
                       <a:avLst/>
                     </a:prstGeom>
+                    <a:noFill/>
                   </pic:spPr>
                 </pic:pic>
               </a:graphicData>
@@ -5089,6 +5045,7 @@
                     <a:prstGeom prst="rect">
                       <a:avLst/>
                     </a:prstGeom>
+                    <a:noFill/>
                   </pic:spPr>
                 </pic:pic>
               </a:graphicData>
@@ -5199,6 +5156,7 @@
                     <a:prstGeom prst="rect">
                       <a:avLst/>
                     </a:prstGeom>
+                    <a:noFill/>
                   </pic:spPr>
                 </pic:pic>
               </a:graphicData>
@@ -5266,9 +5224,10 @@
     <w:sectPr>
       <w:headerReference w:type="even" r:id="rId25"/>
       <w:headerReference w:type="default" r:id="rId26"/>
-      <w:footerReference w:type="even" r:id="rId27"/>
-      <w:footerReference w:type="default" r:id="rId28"/>
-      <w:footerReference w:type="first" r:id="rId29"/>
+      <w:headerReference w:type="first" r:id="rId27"/>
+      <w:footerReference w:type="even" r:id="rId28"/>
+      <w:footerReference w:type="default" r:id="rId29"/>
+      <w:footerReference w:type="first" r:id="rId30"/>
       <w:footnotePr>
         <w:numFmt w:val="decimal"/>
       </w:footnotePr>
@@ -5286,7 +5245,7 @@
 </file>
 
 <file path=word/footer1.xml><?xml version="1.0" encoding="utf-8"?>
-<w:ftr xmlns:o="urn:schemas-microsoft-com:office:office" xmlns:r="http://schemas.openxmlformats.org/officeDocument/2006/relationships" xmlns:v="urn:schemas-microsoft-com:vml" xmlns:w="http://schemas.openxmlformats.org/wordprocessingml/2006/main" xmlns:w10="urn:schemas-microsoft-com:office:word" xmlns:wp="http://schemas.openxmlformats.org/drawingml/2006/wordprocessingDrawing" xmlns:wps="http://schemas.microsoft.com/office/word/2010/wordprocessingShape" xmlns:wpg="http://schemas.microsoft.com/office/word/2010/wordprocessingGroup" xmlns:mc="http://schemas.openxmlformats.org/markup-compatibility/2006" xmlns:wp14="http://schemas.microsoft.com/office/word/2010/wordprocessingDrawing" xmlns:w14="http://schemas.microsoft.com/office/word/2010/wordml" xmlns:w15="http://schemas.microsoft.com/office/word/2012/wordml" mc:Ignorable="w14 wp14 w15">
+<w:ftr xmlns:o="urn:schemas-microsoft-com:office:office" xmlns:r="http://schemas.openxmlformats.org/officeDocument/2006/relationships" xmlns:v="urn:schemas-microsoft-com:vml" xmlns:w="http://schemas.openxmlformats.org/wordprocessingml/2006/main" xmlns:w10="urn:schemas-microsoft-com:office:word" xmlns:wp="http://schemas.openxmlformats.org/drawingml/2006/wordprocessingDrawing" xmlns:pic="http://schemas.openxmlformats.org/drawingml/2006/picture" xmlns:wps="http://schemas.microsoft.com/office/word/2010/wordprocessingShape" xmlns:wpg="http://schemas.microsoft.com/office/word/2010/wordprocessingGroup" xmlns:mc="http://schemas.openxmlformats.org/markup-compatibility/2006" xmlns:wp14="http://schemas.microsoft.com/office/word/2010/wordprocessingDrawing" xmlns:w14="http://schemas.microsoft.com/office/word/2010/wordml" xmlns:w15="http://schemas.microsoft.com/office/word/2012/wordml" mc:Ignorable="w14 wp14 w15">
   <w:p>
     <w:pPr>
       <w:pStyle w:val="Footer"/>
@@ -5332,7 +5291,7 @@
 </file>
 
 <file path=word/footer2.xml><?xml version="1.0" encoding="utf-8"?>
-<w:ftr xmlns:o="urn:schemas-microsoft-com:office:office" xmlns:r="http://schemas.openxmlformats.org/officeDocument/2006/relationships" xmlns:v="urn:schemas-microsoft-com:vml" xmlns:w="http://schemas.openxmlformats.org/wordprocessingml/2006/main" xmlns:w10="urn:schemas-microsoft-com:office:word" xmlns:wp="http://schemas.openxmlformats.org/drawingml/2006/wordprocessingDrawing" xmlns:wps="http://schemas.microsoft.com/office/word/2010/wordprocessingShape" xmlns:wpg="http://schemas.microsoft.com/office/word/2010/wordprocessingGroup" xmlns:mc="http://schemas.openxmlformats.org/markup-compatibility/2006" xmlns:wp14="http://schemas.microsoft.com/office/word/2010/wordprocessingDrawing" xmlns:w14="http://schemas.microsoft.com/office/word/2010/wordml" xmlns:w15="http://schemas.microsoft.com/office/word/2012/wordml" mc:Ignorable="w14 wp14 w15">
+<w:ftr xmlns:o="urn:schemas-microsoft-com:office:office" xmlns:r="http://schemas.openxmlformats.org/officeDocument/2006/relationships" xmlns:v="urn:schemas-microsoft-com:vml" xmlns:w="http://schemas.openxmlformats.org/wordprocessingml/2006/main" xmlns:w10="urn:schemas-microsoft-com:office:word" xmlns:wp="http://schemas.openxmlformats.org/drawingml/2006/wordprocessingDrawing" xmlns:pic="http://schemas.openxmlformats.org/drawingml/2006/picture" xmlns:wps="http://schemas.microsoft.com/office/word/2010/wordprocessingShape" xmlns:wpg="http://schemas.microsoft.com/office/word/2010/wordprocessingGroup" xmlns:mc="http://schemas.openxmlformats.org/markup-compatibility/2006" xmlns:wp14="http://schemas.microsoft.com/office/word/2010/wordprocessingDrawing" xmlns:w14="http://schemas.microsoft.com/office/word/2010/wordml" xmlns:w15="http://schemas.microsoft.com/office/word/2012/wordml" mc:Ignorable="w14 wp14 w15">
   <w:p>
     <w:pPr>
       <w:pStyle w:val="Footer"/>
@@ -5357,7 +5316,7 @@
     </w:r>
     <w:r>
       <w:rPr/>
-      <w:t>3</w:t>
+      <w:t>4</w:t>
     </w:r>
     <w:r>
       <w:rPr/>
@@ -5379,7 +5338,7 @@
 </file>
 
 <file path=word/footer3.xml><?xml version="1.0" encoding="utf-8"?>
-<w:ftr xmlns:o="urn:schemas-microsoft-com:office:office" xmlns:r="http://schemas.openxmlformats.org/officeDocument/2006/relationships" xmlns:v="urn:schemas-microsoft-com:vml" xmlns:w="http://schemas.openxmlformats.org/wordprocessingml/2006/main" xmlns:w10="urn:schemas-microsoft-com:office:word" xmlns:wp="http://schemas.openxmlformats.org/drawingml/2006/wordprocessingDrawing" xmlns:wps="http://schemas.microsoft.com/office/word/2010/wordprocessingShape" xmlns:wpg="http://schemas.microsoft.com/office/word/2010/wordprocessingGroup" xmlns:mc="http://schemas.openxmlformats.org/markup-compatibility/2006" xmlns:wp14="http://schemas.microsoft.com/office/word/2010/wordprocessingDrawing" xmlns:w14="http://schemas.microsoft.com/office/word/2010/wordml" xmlns:w15="http://schemas.microsoft.com/office/word/2012/wordml" mc:Ignorable="w14 wp14 w15">
+<w:ftr xmlns:o="urn:schemas-microsoft-com:office:office" xmlns:r="http://schemas.openxmlformats.org/officeDocument/2006/relationships" xmlns:v="urn:schemas-microsoft-com:vml" xmlns:w="http://schemas.openxmlformats.org/wordprocessingml/2006/main" xmlns:w10="urn:schemas-microsoft-com:office:word" xmlns:wp="http://schemas.openxmlformats.org/drawingml/2006/wordprocessingDrawing" xmlns:pic="http://schemas.openxmlformats.org/drawingml/2006/picture" xmlns:wps="http://schemas.microsoft.com/office/word/2010/wordprocessingShape" xmlns:wpg="http://schemas.microsoft.com/office/word/2010/wordprocessingGroup" xmlns:mc="http://schemas.openxmlformats.org/markup-compatibility/2006" xmlns:wp14="http://schemas.microsoft.com/office/word/2010/wordprocessingDrawing" xmlns:w14="http://schemas.microsoft.com/office/word/2010/wordml" xmlns:w15="http://schemas.microsoft.com/office/word/2012/wordml" mc:Ignorable="w14 wp14 w15">
   <w:p>
     <w:pPr>
       <w:pStyle w:val="Footer"/>
@@ -5394,14 +5353,9 @@
 </file>
 
 <file path=word/footnotes.xml><?xml version="1.0" encoding="utf-8"?>
-<w:footnotes xmlns:o="urn:schemas-microsoft-com:office:office" xmlns:r="http://schemas.openxmlformats.org/officeDocument/2006/relationships" xmlns:v="urn:schemas-microsoft-com:vml" xmlns:w="http://schemas.openxmlformats.org/wordprocessingml/2006/main" xmlns:w10="urn:schemas-microsoft-com:office:word" xmlns:wp="http://schemas.openxmlformats.org/drawingml/2006/wordprocessingDrawing" xmlns:wps="http://schemas.microsoft.com/office/word/2010/wordprocessingShape" xmlns:wpg="http://schemas.microsoft.com/office/word/2010/wordprocessingGroup" xmlns:mc="http://schemas.openxmlformats.org/markup-compatibility/2006" xmlns:wp14="http://schemas.microsoft.com/office/word/2010/wordprocessingDrawing" xmlns:w14="http://schemas.microsoft.com/office/word/2010/wordml" xmlns:w15="http://schemas.microsoft.com/office/word/2012/wordml" mc:Ignorable="w14 wp14 w15">
+<w:footnotes xmlns:o="urn:schemas-microsoft-com:office:office" xmlns:r="http://schemas.openxmlformats.org/officeDocument/2006/relationships" xmlns:v="urn:schemas-microsoft-com:vml" xmlns:w="http://schemas.openxmlformats.org/wordprocessingml/2006/main" xmlns:w10="urn:schemas-microsoft-com:office:word" xmlns:wp="http://schemas.openxmlformats.org/drawingml/2006/wordprocessingDrawing" xmlns:pic="http://schemas.openxmlformats.org/drawingml/2006/picture" xmlns:wps="http://schemas.microsoft.com/office/word/2010/wordprocessingShape" xmlns:wpg="http://schemas.microsoft.com/office/word/2010/wordprocessingGroup" xmlns:mc="http://schemas.openxmlformats.org/markup-compatibility/2006" xmlns:wp14="http://schemas.microsoft.com/office/word/2010/wordprocessingDrawing" xmlns:w14="http://schemas.microsoft.com/office/word/2010/wordml" xmlns:w15="http://schemas.microsoft.com/office/word/2012/wordml" mc:Ignorable="w14 wp14 w15">
   <w:footnote w:id="0" w:type="separator">
     <w:p>
-      <w:pPr>
-        <w:rPr>
-          <w:sz w:val="12"/>
-        </w:rPr>
-      </w:pPr>
       <w:r>
         <w:separator/>
       </w:r>
@@ -5409,11 +5363,6 @@
   </w:footnote>
   <w:footnote w:id="1" w:type="continuationSeparator">
     <w:p>
-      <w:pPr>
-        <w:rPr>
-          <w:sz w:val="12"/>
-        </w:rPr>
-      </w:pPr>
       <w:r>
         <w:continuationSeparator/>
       </w:r>
@@ -5467,7 +5416,7 @@
 </file>
 
 <file path=word/header1.xml><?xml version="1.0" encoding="utf-8"?>
-<w:hdr xmlns:o="urn:schemas-microsoft-com:office:office" xmlns:r="http://schemas.openxmlformats.org/officeDocument/2006/relationships" xmlns:v="urn:schemas-microsoft-com:vml" xmlns:w="http://schemas.openxmlformats.org/wordprocessingml/2006/main" xmlns:w10="urn:schemas-microsoft-com:office:word" xmlns:wp="http://schemas.openxmlformats.org/drawingml/2006/wordprocessingDrawing" xmlns:wps="http://schemas.microsoft.com/office/word/2010/wordprocessingShape" xmlns:wpg="http://schemas.microsoft.com/office/word/2010/wordprocessingGroup" xmlns:mc="http://schemas.openxmlformats.org/markup-compatibility/2006" xmlns:wp14="http://schemas.microsoft.com/office/word/2010/wordprocessingDrawing" xmlns:w14="http://schemas.microsoft.com/office/word/2010/wordml" xmlns:w15="http://schemas.microsoft.com/office/word/2012/wordml" mc:Ignorable="w14 wp14 w15">
+<w:hdr xmlns:o="urn:schemas-microsoft-com:office:office" xmlns:r="http://schemas.openxmlformats.org/officeDocument/2006/relationships" xmlns:v="urn:schemas-microsoft-com:vml" xmlns:w="http://schemas.openxmlformats.org/wordprocessingml/2006/main" xmlns:w10="urn:schemas-microsoft-com:office:word" xmlns:wp="http://schemas.openxmlformats.org/drawingml/2006/wordprocessingDrawing" xmlns:pic="http://schemas.openxmlformats.org/drawingml/2006/picture" xmlns:wps="http://schemas.microsoft.com/office/word/2010/wordprocessingShape" xmlns:wpg="http://schemas.microsoft.com/office/word/2010/wordprocessingGroup" xmlns:mc="http://schemas.openxmlformats.org/markup-compatibility/2006" xmlns:wp14="http://schemas.microsoft.com/office/word/2010/wordprocessingDrawing" xmlns:w14="http://schemas.microsoft.com/office/word/2010/wordml" xmlns:w15="http://schemas.microsoft.com/office/word/2012/wordml" mc:Ignorable="w14 wp14 w15">
   <w:p>
     <w:pPr>
       <w:pStyle w:val="Header"/>
@@ -5535,7 +5484,7 @@
       <mc:AlternateContent>
         <mc:Choice Requires="wps">
           <w:drawing>
-            <wp:anchor behindDoc="1" distT="6985" distB="6350" distL="6985" distR="6985" simplePos="0" locked="0" layoutInCell="1" allowOverlap="1" relativeHeight="15" wp14:anchorId="77472CCE">
+            <wp:anchor behindDoc="1" distT="6985" distB="6350" distL="6985" distR="6985" simplePos="0" locked="0" layoutInCell="1" allowOverlap="1" relativeHeight="26" wp14:anchorId="77472CCE">
               <wp:simplePos x="0" y="0"/>
               <wp:positionH relativeFrom="column">
                 <wp:posOffset>0</wp:posOffset>
@@ -5595,7 +5544,7 @@
 </file>
 
 <file path=word/header2.xml><?xml version="1.0" encoding="utf-8"?>
-<w:hdr xmlns:o="urn:schemas-microsoft-com:office:office" xmlns:r="http://schemas.openxmlformats.org/officeDocument/2006/relationships" xmlns:v="urn:schemas-microsoft-com:vml" xmlns:w="http://schemas.openxmlformats.org/wordprocessingml/2006/main" xmlns:w10="urn:schemas-microsoft-com:office:word" xmlns:wp="http://schemas.openxmlformats.org/drawingml/2006/wordprocessingDrawing" xmlns:wps="http://schemas.microsoft.com/office/word/2010/wordprocessingShape" xmlns:wpg="http://schemas.microsoft.com/office/word/2010/wordprocessingGroup" xmlns:mc="http://schemas.openxmlformats.org/markup-compatibility/2006" xmlns:wp14="http://schemas.microsoft.com/office/word/2010/wordprocessingDrawing" xmlns:w14="http://schemas.microsoft.com/office/word/2010/wordml" xmlns:w15="http://schemas.microsoft.com/office/word/2012/wordml" mc:Ignorable="w14 wp14 w15">
+<w:hdr xmlns:o="urn:schemas-microsoft-com:office:office" xmlns:r="http://schemas.openxmlformats.org/officeDocument/2006/relationships" xmlns:v="urn:schemas-microsoft-com:vml" xmlns:w="http://schemas.openxmlformats.org/wordprocessingml/2006/main" xmlns:w10="urn:schemas-microsoft-com:office:word" xmlns:wp="http://schemas.openxmlformats.org/drawingml/2006/wordprocessingDrawing" xmlns:pic="http://schemas.openxmlformats.org/drawingml/2006/picture" xmlns:wps="http://schemas.microsoft.com/office/word/2010/wordprocessingShape" xmlns:wpg="http://schemas.microsoft.com/office/word/2010/wordprocessingGroup" xmlns:mc="http://schemas.openxmlformats.org/markup-compatibility/2006" xmlns:wp14="http://schemas.microsoft.com/office/word/2010/wordprocessingDrawing" xmlns:w14="http://schemas.microsoft.com/office/word/2010/wordml" xmlns:w15="http://schemas.microsoft.com/office/word/2012/wordml" mc:Ignorable="w14 wp14 w15">
   <w:p>
     <w:pPr>
       <w:pStyle w:val="Header"/>
@@ -5616,7 +5565,7 @@
       <mc:AlternateContent>
         <mc:Choice Requires="wps">
           <w:drawing>
-            <wp:anchor behindDoc="1" distT="6350" distB="6350" distL="6350" distR="6350" simplePos="0" locked="0" layoutInCell="1" allowOverlap="1" relativeHeight="14" wp14:anchorId="016223C6">
+            <wp:anchor behindDoc="1" distT="6350" distB="6350" distL="6350" distR="6350" simplePos="0" locked="0" layoutInCell="1" allowOverlap="1" relativeHeight="25" wp14:anchorId="016223C6">
               <wp:simplePos x="0" y="0"/>
               <wp:positionH relativeFrom="column">
                 <wp:posOffset>0</wp:posOffset>
@@ -5704,6 +5653,7 @@
                   <a:prstGeom prst="rect">
                     <a:avLst/>
                   </a:prstGeom>
+                  <a:noFill/>
                 </pic:spPr>
               </pic:pic>
             </a:graphicData>
@@ -5729,6 +5679,20 @@
   <w:p>
     <w:pPr>
       <w:pStyle w:val="Normal"/>
+      <w:rPr/>
+    </w:pPr>
+    <w:r>
+      <w:rPr/>
+    </w:r>
+  </w:p>
+</w:hdr>
+</file>
+
+<file path=word/header3.xml><?xml version="1.0" encoding="utf-8"?>
+<w:hdr xmlns:o="urn:schemas-microsoft-com:office:office" xmlns:r="http://schemas.openxmlformats.org/officeDocument/2006/relationships" xmlns:v="urn:schemas-microsoft-com:vml" xmlns:w="http://schemas.openxmlformats.org/wordprocessingml/2006/main" xmlns:w10="urn:schemas-microsoft-com:office:word" xmlns:wp="http://schemas.openxmlformats.org/drawingml/2006/wordprocessingDrawing" xmlns:pic="http://schemas.openxmlformats.org/drawingml/2006/picture" xmlns:wps="http://schemas.microsoft.com/office/word/2010/wordprocessingShape" xmlns:wpg="http://schemas.microsoft.com/office/word/2010/wordprocessingGroup" xmlns:mc="http://schemas.openxmlformats.org/markup-compatibility/2006" xmlns:wp14="http://schemas.microsoft.com/office/word/2010/wordprocessingDrawing" xmlns:w14="http://schemas.microsoft.com/office/word/2010/wordml" xmlns:w15="http://schemas.microsoft.com/office/word/2012/wordml" mc:Ignorable="w14 wp14 w15">
+  <w:p>
+    <w:pPr>
+      <w:pStyle w:val="Header"/>
       <w:rPr/>
     </w:pPr>
     <w:r>
@@ -8029,7 +7993,7 @@
     </w:rPr>
   </w:style>
   <w:style w:type="paragraph" w:styleId="Heading1">
-    <w:name w:val="Heading 1"/>
+    <w:name w:val="heading 1"/>
     <w:basedOn w:val="Normal"/>
     <w:next w:val="Flietext"/>
     <w:qFormat/>
@@ -8054,10 +8018,10 @@
     </w:rPr>
   </w:style>
   <w:style w:type="paragraph" w:styleId="Heading2">
-    <w:name w:val="Heading 2"/>
+    <w:name w:val="heading 2"/>
     <w:basedOn w:val="Heading1"/>
     <w:next w:val="Flietext"/>
-    <w:link w:val="Berschrift2Zchn"/>
+    <w:link w:val="berschrift2Zchn"/>
     <w:qFormat/>
     <w:rsid w:val="0092397e"/>
     <w:pPr>
@@ -8076,10 +8040,10 @@
     </w:rPr>
   </w:style>
   <w:style w:type="paragraph" w:styleId="Heading3">
-    <w:name w:val="Heading 3"/>
+    <w:name w:val="heading 3"/>
     <w:basedOn w:val="Heading2"/>
     <w:next w:val="Flietext"/>
-    <w:link w:val="Berschrift3Zchn"/>
+    <w:link w:val="berschrift3Zchn"/>
     <w:qFormat/>
     <w:rsid w:val="0035519f"/>
     <w:pPr>
@@ -8096,10 +8060,10 @@
     </w:rPr>
   </w:style>
   <w:style w:type="paragraph" w:styleId="Heading4">
-    <w:name w:val="Heading 4"/>
+    <w:name w:val="heading 4"/>
     <w:basedOn w:val="Normal"/>
     <w:next w:val="Flietext"/>
-    <w:link w:val="Berschrift4Zchn"/>
+    <w:link w:val="berschrift4Zchn"/>
     <w:qFormat/>
     <w:rsid w:val="0035519f"/>
     <w:pPr>
@@ -8120,10 +8084,10 @@
     </w:rPr>
   </w:style>
   <w:style w:type="paragraph" w:styleId="Heading5">
-    <w:name w:val="Heading 5"/>
+    <w:name w:val="heading 5"/>
     <w:basedOn w:val="Normal"/>
     <w:next w:val="Flietext"/>
-    <w:link w:val="Berschrift5Zchn"/>
+    <w:link w:val="berschrift5Zchn"/>
     <w:qFormat/>
     <w:rsid w:val="00a21c10"/>
     <w:pPr>
@@ -8144,10 +8108,10 @@
     </w:rPr>
   </w:style>
   <w:style w:type="paragraph" w:styleId="Heading6">
-    <w:name w:val="Heading 6"/>
+    <w:name w:val="heading 6"/>
     <w:basedOn w:val="Normal"/>
     <w:next w:val="Normal"/>
-    <w:link w:val="Berschrift6Zchn"/>
+    <w:link w:val="berschrift6Zchn"/>
     <w:uiPriority w:val="9"/>
     <w:qFormat/>
     <w:rsid w:val="009860ba"/>
@@ -8166,10 +8130,10 @@
     </w:rPr>
   </w:style>
   <w:style w:type="paragraph" w:styleId="Heading7">
-    <w:name w:val="Heading 7"/>
+    <w:name w:val="heading 7"/>
     <w:basedOn w:val="Normal"/>
     <w:next w:val="Normal"/>
-    <w:link w:val="Berschrift7Zchn"/>
+    <w:link w:val="berschrift7Zchn"/>
     <w:uiPriority w:val="9"/>
     <w:qFormat/>
     <w:rsid w:val="009860ba"/>
@@ -8188,10 +8152,10 @@
     </w:rPr>
   </w:style>
   <w:style w:type="paragraph" w:styleId="Heading8">
-    <w:name w:val="Heading 8"/>
+    <w:name w:val="heading 8"/>
     <w:basedOn w:val="Normal"/>
     <w:next w:val="Normal"/>
-    <w:link w:val="Berschrift8Zchn"/>
+    <w:link w:val="berschrift8Zchn"/>
     <w:uiPriority w:val="9"/>
     <w:qFormat/>
     <w:rsid w:val="009860ba"/>
@@ -8209,10 +8173,10 @@
     </w:rPr>
   </w:style>
   <w:style w:type="paragraph" w:styleId="Heading9">
-    <w:name w:val="Heading 9"/>
+    <w:name w:val="heading 9"/>
     <w:basedOn w:val="Normal"/>
     <w:next w:val="Normal"/>
-    <w:link w:val="Berschrift9Zchn"/>
+    <w:link w:val="berschrift9Zchn"/>
     <w:uiPriority w:val="9"/>
     <w:qFormat/>
     <w:rsid w:val="009860ba"/>
@@ -8258,7 +8222,7 @@
       <w:lang w:val="en-GB"/>
     </w:rPr>
   </w:style>
-  <w:style w:type="character" w:styleId="Pagenumber">
+  <w:style w:type="character" w:styleId="PageNumber">
     <w:name w:val="page number"/>
     <w:qFormat/>
     <w:rsid w:val="0005611d"/>
@@ -8267,7 +8231,7 @@
       <w:sz w:val="20"/>
     </w:rPr>
   </w:style>
-  <w:style w:type="character" w:styleId="Berschrift2Zchn" w:customStyle="1">
+  <w:style w:type="character" w:styleId="berschrift2Zchn" w:customStyle="1">
     <w:name w:val="Überschrift 2 Zchn"/>
     <w:link w:val="Heading2"/>
     <w:qFormat/>
@@ -8426,7 +8390,7 @@
       <w:lang w:val="en-US" w:eastAsia="en-US"/>
     </w:rPr>
   </w:style>
-  <w:style w:type="character" w:styleId="Text" w:customStyle="1">
+  <w:style w:type="character" w:styleId="text" w:customStyle="1">
     <w:name w:val="text"/>
     <w:basedOn w:val="DefaultParagraphFont"/>
     <w:qFormat/>
@@ -8603,7 +8567,7 @@
   </w:style>
   <w:style w:type="character" w:styleId="KommentartextZchn" w:customStyle="1">
     <w:name w:val="Kommentartext Zchn"/>
-    <w:link w:val="Annotationtext"/>
+    <w:link w:val="CommentText"/>
     <w:uiPriority w:val="99"/>
     <w:semiHidden/>
     <w:qFormat/>
@@ -8614,7 +8578,7 @@
   </w:style>
   <w:style w:type="character" w:styleId="KommentarthemaZchn" w:customStyle="1">
     <w:name w:val="Kommentarthema Zchn"/>
-    <w:link w:val="Annotationsubject"/>
+    <w:link w:val="annotationsubject"/>
     <w:uiPriority w:val="99"/>
     <w:semiHidden/>
     <w:qFormat/>
@@ -8627,7 +8591,7 @@
   </w:style>
   <w:style w:type="character" w:styleId="MakrotextZchn" w:customStyle="1">
     <w:name w:val="Makrotext Zchn"/>
-    <w:link w:val="Macro"/>
+    <w:link w:val="MacroText"/>
     <w:uiPriority w:val="99"/>
     <w:semiHidden/>
     <w:qFormat/>
@@ -8734,7 +8698,7 @@
       <w:szCs w:val="24"/>
     </w:rPr>
   </w:style>
-  <w:style w:type="character" w:styleId="Berschrift6Zchn" w:customStyle="1">
+  <w:style w:type="character" w:styleId="berschrift6Zchn" w:customStyle="1">
     <w:name w:val="Überschrift 6 Zchn"/>
     <w:link w:val="Heading6"/>
     <w:uiPriority w:val="9"/>
@@ -8749,7 +8713,7 @@
       <w:szCs w:val="24"/>
     </w:rPr>
   </w:style>
-  <w:style w:type="character" w:styleId="Berschrift7Zchn" w:customStyle="1">
+  <w:style w:type="character" w:styleId="berschrift7Zchn" w:customStyle="1">
     <w:name w:val="Überschrift 7 Zchn"/>
     <w:link w:val="Heading7"/>
     <w:uiPriority w:val="9"/>
@@ -8764,7 +8728,7 @@
       <w:szCs w:val="24"/>
     </w:rPr>
   </w:style>
-  <w:style w:type="character" w:styleId="Berschrift8Zchn" w:customStyle="1">
+  <w:style w:type="character" w:styleId="berschrift8Zchn" w:customStyle="1">
     <w:name w:val="Überschrift 8 Zchn"/>
     <w:link w:val="Heading8"/>
     <w:uiPriority w:val="9"/>
@@ -8776,7 +8740,7 @@
       <w:color w:val="404040"/>
     </w:rPr>
   </w:style>
-  <w:style w:type="character" w:styleId="Berschrift9Zchn" w:customStyle="1">
+  <w:style w:type="character" w:styleId="berschrift9Zchn" w:customStyle="1">
     <w:name w:val="Überschrift 9 Zchn"/>
     <w:link w:val="Heading9"/>
     <w:uiPriority w:val="9"/>
@@ -8847,7 +8811,7 @@
       <w:szCs w:val="24"/>
     </w:rPr>
   </w:style>
-  <w:style w:type="character" w:styleId="Berschrift4Zchn" w:customStyle="1">
+  <w:style w:type="character" w:styleId="berschrift4Zchn" w:customStyle="1">
     <w:name w:val="Überschrift 4 Zchn"/>
     <w:link w:val="Heading4"/>
     <w:qFormat/>
@@ -8861,7 +8825,7 @@
       <w:lang w:val="x-none" w:eastAsia="x-none"/>
     </w:rPr>
   </w:style>
-  <w:style w:type="character" w:styleId="Berschrift3Zchn" w:customStyle="1">
+  <w:style w:type="character" w:styleId="berschrift3Zchn" w:customStyle="1">
     <w:name w:val="Überschrift 3 Zchn"/>
     <w:link w:val="Heading3"/>
     <w:qFormat/>
@@ -8878,7 +8842,7 @@
       <w:lang w:val="en-GB" w:eastAsia="x-none"/>
     </w:rPr>
   </w:style>
-  <w:style w:type="character" w:styleId="Berschrift5Zchn" w:customStyle="1">
+  <w:style w:type="character" w:styleId="berschrift5Zchn" w:customStyle="1">
     <w:name w:val="Überschrift 5 Zchn"/>
     <w:link w:val="Heading5"/>
     <w:qFormat/>
@@ -8970,11 +8934,18 @@
     <w:qFormat/>
     <w:rPr/>
   </w:style>
-  <w:style w:type="character" w:styleId="Bullets">
-    <w:name w:val="Bullets"/>
+  <w:style w:type="character" w:styleId="Bulletsuser">
+    <w:name w:val="Bullets (user)"/>
     <w:qFormat/>
     <w:rPr>
       <w:rFonts w:ascii="OpenSymbol" w:hAnsi="OpenSymbol" w:eastAsia="OpenSymbol" w:cs="OpenSymbol"/>
+    </w:rPr>
+  </w:style>
+  <w:style w:type="character" w:styleId="FootnoteCharactersuser">
+    <w:name w:val="Footnote Characters (user)"/>
+    <w:qFormat/>
+    <w:rPr>
+      <w:vertAlign w:val="superscript"/>
     </w:rPr>
   </w:style>
   <w:style w:type="character" w:styleId="FootnoteCharacters">
@@ -8985,7 +8956,14 @@
     </w:rPr>
   </w:style>
   <w:style w:type="character" w:styleId="FootnoteReference">
-    <w:name w:val="Footnote Reference"/>
+    <w:name w:val="footnote reference"/>
+    <w:rPr>
+      <w:vertAlign w:val="superscript"/>
+    </w:rPr>
+  </w:style>
+  <w:style w:type="character" w:styleId="EndnoteCharactersuser">
+    <w:name w:val="Endnote Characters (user)"/>
+    <w:qFormat/>
     <w:rPr>
       <w:vertAlign w:val="superscript"/>
     </w:rPr>
@@ -8998,7 +8976,7 @@
     </w:rPr>
   </w:style>
   <w:style w:type="character" w:styleId="EndnoteReference">
-    <w:name w:val="Endnote Reference"/>
+    <w:name w:val="endnote reference"/>
     <w:rPr>
       <w:vertAlign w:val="superscript"/>
     </w:rPr>
@@ -9044,7 +9022,7 @@
     <w:rPr/>
   </w:style>
   <w:style w:type="paragraph" w:styleId="Caption">
-    <w:name w:val="Caption"/>
+    <w:name w:val="caption"/>
     <w:basedOn w:val="Normal"/>
     <w:qFormat/>
     <w:pPr>
@@ -9078,7 +9056,7 @@
     <w:rPr/>
   </w:style>
   <w:style w:type="paragraph" w:styleId="Header">
-    <w:name w:val="Header"/>
+    <w:name w:val="header"/>
     <w:basedOn w:val="Normal"/>
     <w:rsid w:val="00187e76"/>
     <w:pPr>
@@ -9091,7 +9069,7 @@
     <w:rPr/>
   </w:style>
   <w:style w:type="paragraph" w:styleId="Footer">
-    <w:name w:val="Footer"/>
+    <w:name w:val="footer"/>
     <w:basedOn w:val="Normal"/>
     <w:link w:val="FuzeileZchn"/>
     <w:rsid w:val="0005611d"/>
@@ -9143,7 +9121,7 @@
     <w:rPr/>
   </w:style>
   <w:style w:type="paragraph" w:styleId="TOC1">
-    <w:name w:val="TOC 1"/>
+    <w:name w:val="toc 1"/>
     <w:next w:val="Normal"/>
     <w:uiPriority w:val="39"/>
     <w:qFormat/>
@@ -9166,7 +9144,7 @@
     </w:rPr>
   </w:style>
   <w:style w:type="paragraph" w:styleId="TOC2">
-    <w:name w:val="TOC 2"/>
+    <w:name w:val="toc 2"/>
     <w:basedOn w:val="Normal"/>
     <w:uiPriority w:val="39"/>
     <w:rsid w:val="007c1aed"/>
@@ -9179,7 +9157,7 @@
     </w:rPr>
   </w:style>
   <w:style w:type="paragraph" w:styleId="TOC3">
-    <w:name w:val="TOC 3"/>
+    <w:name w:val="toc 3"/>
     <w:basedOn w:val="Normal"/>
     <w:next w:val="Normal"/>
     <w:uiPriority w:val="39"/>
@@ -9359,7 +9337,7 @@
     </w:rPr>
   </w:style>
   <w:style w:type="paragraph" w:styleId="TOC4">
-    <w:name w:val="TOC 4"/>
+    <w:name w:val="toc 4"/>
     <w:basedOn w:val="Normal"/>
     <w:next w:val="Normal"/>
     <w:autoRedefine/>
@@ -9494,7 +9472,7 @@
     </w:rPr>
   </w:style>
   <w:style w:type="paragraph" w:styleId="TableofFigures">
-    <w:name w:val="Table of Figures"/>
+    <w:name w:val="table of figures"/>
     <w:basedOn w:val="Normal"/>
     <w:next w:val="Normal"/>
     <w:uiPriority w:val="99"/>
@@ -9569,7 +9547,7 @@
     </w:pPr>
     <w:rPr/>
   </w:style>
-  <w:style w:type="paragraph" w:styleId="Caption1">
+  <w:style w:type="paragraph" w:styleId="caption1">
     <w:name w:val="caption1"/>
     <w:basedOn w:val="Normal"/>
     <w:next w:val="Normal"/>
@@ -9658,7 +9636,7 @@
     </w:rPr>
   </w:style>
   <w:style w:type="paragraph" w:styleId="EndnoteText">
-    <w:name w:val="Endnote Text"/>
+    <w:name w:val="endnote text"/>
     <w:basedOn w:val="Normal"/>
     <w:link w:val="EndnotentextZchn"/>
     <w:uiPriority w:val="99"/>
@@ -9687,7 +9665,7 @@
     </w:rPr>
   </w:style>
   <w:style w:type="paragraph" w:styleId="FootnoteText">
-    <w:name w:val="Footnote Text"/>
+    <w:name w:val="footnote text"/>
     <w:basedOn w:val="Normal"/>
     <w:link w:val="FunotentextZchn"/>
     <w:uiPriority w:val="99"/>
@@ -9882,7 +9860,7 @@
     </w:pPr>
     <w:rPr/>
   </w:style>
-  <w:style w:type="paragraph" w:styleId="Indexheading">
+  <w:style w:type="paragraph" w:styleId="IndexHeading">
     <w:name w:val="index heading"/>
     <w:basedOn w:val="Normal"/>
     <w:next w:val="Index1"/>
@@ -9920,7 +9898,7 @@
       <w:szCs w:val="28"/>
     </w:rPr>
   </w:style>
-  <w:style w:type="paragraph" w:styleId="Annotationtext">
+  <w:style w:type="paragraph" w:styleId="CommentText">
     <w:name w:val="annotation text"/>
     <w:basedOn w:val="Normal"/>
     <w:link w:val="KommentartextZchn"/>
@@ -9935,10 +9913,10 @@
       <w:lang w:val="x-none" w:eastAsia="x-none"/>
     </w:rPr>
   </w:style>
-  <w:style w:type="paragraph" w:styleId="Annotationsubject">
+  <w:style w:type="paragraph" w:styleId="annotationsubject">
     <w:name w:val="annotation subject"/>
-    <w:basedOn w:val="Annotationtext"/>
-    <w:next w:val="Annotationtext"/>
+    <w:basedOn w:val="CommentText"/>
+    <w:next w:val="CommentText"/>
     <w:link w:val="KommentarthemaZchn"/>
     <w:uiPriority w:val="99"/>
     <w:semiHidden/>
@@ -10191,7 +10169,7 @@
     <w:pPr/>
     <w:rPr/>
   </w:style>
-  <w:style w:type="paragraph" w:styleId="Macro">
+  <w:style w:type="paragraph" w:styleId="MacroText">
     <w:name w:val="macro"/>
     <w:link w:val="MakrotextZchn"/>
     <w:uiPriority w:val="99"/>
@@ -10252,7 +10230,7 @@
       <w:lang w:val="x-none" w:eastAsia="x-none"/>
     </w:rPr>
   </w:style>
-  <w:style w:type="paragraph" w:styleId="Tableofauthorities">
+  <w:style w:type="paragraph" w:styleId="TableofAuthorities">
     <w:name w:val="table of authorities"/>
     <w:basedOn w:val="Normal"/>
     <w:next w:val="Normal"/>
@@ -10266,7 +10244,7 @@
     </w:pPr>
     <w:rPr/>
   </w:style>
-  <w:style w:type="paragraph" w:styleId="Toaheading">
+  <w:style w:type="paragraph" w:styleId="toaheading">
     <w:name w:val="toa heading"/>
     <w:basedOn w:val="Normal"/>
     <w:next w:val="Normal"/>
@@ -10428,7 +10406,7 @@
     </w:pPr>
     <w:rPr/>
   </w:style>
-  <w:style w:type="paragraph" w:styleId="Envelopereturn">
+  <w:style w:type="paragraph" w:styleId="EnvelopeReturn">
     <w:name w:val="envelope return"/>
     <w:basedOn w:val="Normal"/>
     <w:uiPriority w:val="99"/>
@@ -10442,7 +10420,7 @@
       <w:szCs w:val="20"/>
     </w:rPr>
   </w:style>
-  <w:style w:type="paragraph" w:styleId="Envelopeaddress">
+  <w:style w:type="paragraph" w:styleId="EnvelopeAddress">
     <w:name w:val="envelope address"/>
     <w:basedOn w:val="Normal"/>
     <w:uiPriority w:val="99"/>
@@ -10474,7 +10452,7 @@
     </w:rPr>
   </w:style>
   <w:style w:type="paragraph" w:styleId="TOC5">
-    <w:name w:val="TOC 5"/>
+    <w:name w:val="toc 5"/>
     <w:basedOn w:val="Normal"/>
     <w:next w:val="Normal"/>
     <w:autoRedefine/>
@@ -10491,7 +10469,7 @@
     </w:rPr>
   </w:style>
   <w:style w:type="paragraph" w:styleId="TOC6">
-    <w:name w:val="TOC 6"/>
+    <w:name w:val="toc 6"/>
     <w:basedOn w:val="Normal"/>
     <w:next w:val="Normal"/>
     <w:autoRedefine/>
@@ -10508,7 +10486,7 @@
     </w:rPr>
   </w:style>
   <w:style w:type="paragraph" w:styleId="TOC7">
-    <w:name w:val="TOC 7"/>
+    <w:name w:val="toc 7"/>
     <w:basedOn w:val="Normal"/>
     <w:next w:val="Normal"/>
     <w:autoRedefine/>
@@ -10525,7 +10503,7 @@
     </w:rPr>
   </w:style>
   <w:style w:type="paragraph" w:styleId="TOC8">
-    <w:name w:val="TOC 8"/>
+    <w:name w:val="toc 8"/>
     <w:basedOn w:val="Normal"/>
     <w:next w:val="Normal"/>
     <w:autoRedefine/>
@@ -10542,7 +10520,7 @@
     </w:rPr>
   </w:style>
   <w:style w:type="paragraph" w:styleId="TOC9">
-    <w:name w:val="TOC 9"/>
+    <w:name w:val="toc 9"/>
     <w:basedOn w:val="Normal"/>
     <w:next w:val="Normal"/>
     <w:autoRedefine/>
@@ -10651,8 +10629,8 @@
       <w:lang w:val="de-DE" w:eastAsia="de-DE" w:bidi="ar-SA"/>
     </w:rPr>
   </w:style>
-  <w:style w:type="paragraph" w:styleId="FrameContents">
-    <w:name w:val="Frame Contents"/>
+  <w:style w:type="paragraph" w:styleId="FrameContentsuser">
+    <w:name w:val="Frame Contents (user)"/>
     <w:basedOn w:val="Normal"/>
     <w:qFormat/>
     <w:pPr/>
@@ -10686,6 +10664,13 @@
       <w:sz w:val="36"/>
       <w:szCs w:val="36"/>
     </w:rPr>
+  </w:style>
+  <w:style w:type="paragraph" w:styleId="FrameContents">
+    <w:name w:val="Frame Contents"/>
+    <w:basedOn w:val="Normal"/>
+    <w:qFormat/>
+    <w:pPr/>
+    <w:rPr/>
   </w:style>
   <w:style w:type="numbering" w:styleId="NoList" w:default="1">
     <w:name w:val="No List"/>
@@ -10694,7 +10679,7 @@
     <w:unhideWhenUsed/>
     <w:qFormat/>
   </w:style>
-  <w:style w:type="numbering" w:styleId="Berschriften-Gliederung" w:customStyle="1">
+  <w:style w:type="numbering" w:styleId="berschriften-Gliederung" w:customStyle="1">
     <w:name w:val="Überschriften-Gliederung"/>
     <w:uiPriority w:val="99"/>
     <w:qFormat/>

</xml_diff>